<commit_message>
Actualizar generador y configurar envio de correo
</commit_message>
<xml_diff>
--- a/plantilla.docx
+++ b/plantilla.docx
@@ -3,12 +3,23 @@
 <w:document xmlns:wpc="http://schemas.microsoft.com/office/word/2010/wordprocessingCanvas" xmlns:cx="http://schemas.microsoft.com/office/drawing/2014/chartex" xmlns:cx1="http://schemas.microsoft.com/office/drawing/2015/9/8/chartex" xmlns:cx2="http://schemas.microsoft.com/office/drawing/2015/10/21/chartex" xmlns:cx3="http://schemas.microsoft.com/office/drawing/2016/5/9/chartex" xmlns:cx4="http://schemas.microsoft.com/office/drawing/2016/5/10/chartex" xmlns:cx5="http://schemas.microsoft.com/office/drawing/2016/5/11/chartex" xmlns:cx6="http://schemas.microsoft.com/office/drawing/2016/5/12/chartex" xmlns:cx7="http://schemas.microsoft.com/office/drawing/2016/5/13/chartex" xmlns:cx8="http://schemas.microsoft.com/office/drawing/2016/5/14/chartex" xmlns:mc="http://schemas.openxmlformats.org/markup-compatibility/2006" xmlns:aink="http://schemas.microsoft.com/office/drawing/2016/ink" xmlns:am3d="http://schemas.microsoft.com/office/drawing/2017/model3d" xmlns:o="urn:schemas-microsoft-com:office:office" xmlns:r="http://schemas.openxmlformats.org/officeDocument/2006/relationships" xmlns:m="http://schemas.openxmlformats.org/officeDocument/2006/math" xmlns:v="urn:schemas-microsoft-com:vml" xmlns:wp14="http://schemas.microsoft.com/office/word/2010/wordprocessingDrawing" xmlns:wp="http://schemas.openxmlformats.org/drawingml/2006/wordprocessingDrawing" xmlns:w10="urn:schemas-microsoft-com:office:word" xmlns:w="http://schemas.openxmlformats.org/wordprocessingml/2006/main" xmlns:w14="http://schemas.microsoft.com/office/word/2010/wordml" xmlns:w15="http://schemas.microsoft.com/office/word/2012/wordml" xmlns:w16cid="http://schemas.microsoft.com/office/word/2016/wordml/cid" xmlns:w16se="http://schemas.microsoft.com/office/word/2015/wordml/symex" xmlns:wpg="http://schemas.microsoft.com/office/word/2010/wordprocessingGroup" xmlns:wpi="http://schemas.microsoft.com/office/word/2010/wordprocessingInk" xmlns:wne="http://schemas.microsoft.com/office/word/2006/wordml" xmlns:wps="http://schemas.microsoft.com/office/word/2010/wordprocessingShape" mc:Ignorable="w14 w15 w16se w16cid wp14">
   <w:body>
     <w:p>
-      <w:bookmarkStart w:id="0" w:name="_GoBack"/>
       <w:r>
         <w:t>f</w:t>
       </w:r>
       <w:r>
-        <w:t>echa: {{fecha}}</w:t>
+        <w:t>echa: {{</w:t>
+      </w:r>
+      <w:r>
+        <w:t>F</w:t>
+      </w:r>
+      <w:r>
+        <w:t>echa</w:t>
+      </w:r>
+      <w:r>
+        <w:t xml:space="preserve"> de solicitud</w:t>
+      </w:r>
+      <w:r>
+        <w:t>}}</w:t>
       </w:r>
     </w:p>
     <w:p>
@@ -384,7 +395,7 @@
             </w:rPr>
             <w:id w:val="2055731986"/>
             <w14:checkbox>
-              <w14:checked w14:val="1"/>
+              <w14:checked w14:val="0"/>
               <w14:checkedState w14:val="2612" w14:font="MS Gothic"/>
               <w14:uncheckedState w14:val="2610" w14:font="MS Gothic"/>
             </w14:checkbox>
@@ -412,7 +423,7 @@
                     <w:b/>
                     <w:bCs/>
                   </w:rPr>
-                  <w:t>☒</w:t>
+                  <w:t>☐</w:t>
                 </w:r>
               </w:p>
             </w:tc>
@@ -718,7 +729,7 @@
             </w:r>
             <w:proofErr w:type="spellStart"/>
             <w:r>
-              <w:t>descripcion</w:t>
+              <w:t>Descripcion</w:t>
             </w:r>
             <w:proofErr w:type="spellEnd"/>
             <w:r>
@@ -794,7 +805,19 @@
         <w:rPr>
           <w:rFonts w:ascii="Franklin Gothic Medium" w:hAnsi="Franklin Gothic Medium" w:cs="Arial"/>
         </w:rPr>
-        <w:t xml:space="preserve">0005 </w:t>
+        <w:t>000</w:t>
+      </w:r>
+      <w:r>
+        <w:rPr>
+          <w:rFonts w:ascii="Franklin Gothic Medium" w:hAnsi="Franklin Gothic Medium" w:cs="Arial"/>
+        </w:rPr>
+        <w:t>3</w:t>
+      </w:r>
+      <w:r>
+        <w:rPr>
+          <w:rFonts w:ascii="Franklin Gothic Medium" w:hAnsi="Franklin Gothic Medium" w:cs="Arial"/>
+        </w:rPr>
+        <w:t xml:space="preserve"> </w:t>
       </w:r>
       <w:r>
         <w:rPr>
@@ -840,7 +863,13 @@
             <w:rPr>
               <w:rStyle w:val="Estilo1"/>
             </w:rPr>
-            <w:t xml:space="preserve"> del 2025</w:t>
+            <w:t xml:space="preserve"> del 202</w:t>
+          </w:r>
+          <w:r>
+            <w:rPr>
+              <w:rStyle w:val="Estilo1"/>
+            </w:rPr>
+            <w:t>6</w:t>
           </w:r>
         </w:sdtContent>
       </w:sdt>
@@ -1411,7 +1440,10 @@
             </w:r>
             <w:proofErr w:type="spellStart"/>
             <w:r>
-              <w:t>codigo</w:t>
+              <w:t>C</w:t>
+            </w:r>
+            <w:r>
+              <w:t>odigo</w:t>
             </w:r>
             <w:proofErr w:type="spellEnd"/>
             <w:r>
@@ -1447,7 +1479,10 @@
             </w:r>
             <w:proofErr w:type="spellStart"/>
             <w:r>
-              <w:t>descripcion</w:t>
+              <w:t>D</w:t>
+            </w:r>
+            <w:r>
+              <w:t>escripcion</w:t>
             </w:r>
             <w:proofErr w:type="spellEnd"/>
             <w:r>
@@ -1479,14 +1514,17 @@
               </w:rPr>
             </w:pPr>
             <w:r>
-              <w:rPr>
-                <w:rFonts w:ascii="Franklin Gothic Medium" w:eastAsia="Times New Roman" w:hAnsi="Franklin Gothic Medium" w:cs="Arial"/>
-                <w:bCs/>
-                <w:sz w:val="14"/>
-                <w:szCs w:val="12"/>
-                <w:lang w:eastAsia="es-CO"/>
-              </w:rPr>
-              <w:t>[Fecha estimada de inicio de proceso de selecci</w:t>
+              <w:t>{{</w:t>
+            </w:r>
+            <w:r>
+              <w:rPr>
+                <w:rFonts w:ascii="Franklin Gothic Medium" w:eastAsia="Times New Roman" w:hAnsi="Franklin Gothic Medium" w:cs="Arial"/>
+                <w:bCs/>
+                <w:sz w:val="14"/>
+                <w:szCs w:val="12"/>
+                <w:lang w:eastAsia="es-CO"/>
+              </w:rPr>
+              <w:t>Fecha estimada de inicio de proces</w:t>
             </w:r>
             <w:r>
               <w:rPr>
@@ -1497,7 +1535,10 @@
                 <w:lang w:eastAsia="es-CO"/>
               </w:rPr>
               <w:lastRenderedPageBreak/>
-              <w:t>ón (mes)]</w:t>
+              <w:t>o de selección (mes)</w:t>
+            </w:r>
+            <w:r>
+              <w:t>}}</w:t>
             </w:r>
           </w:p>
         </w:tc>
@@ -1525,15 +1566,21 @@
               </w:rPr>
             </w:pPr>
             <w:r>
-              <w:rPr>
-                <w:rFonts w:ascii="Franklin Gothic Medium" w:eastAsia="Times New Roman" w:hAnsi="Franklin Gothic Medium" w:cs="Arial"/>
-                <w:bCs/>
-                <w:sz w:val="14"/>
-                <w:szCs w:val="12"/>
-                <w:lang w:eastAsia="es-CO"/>
-              </w:rPr>
               <w:lastRenderedPageBreak/>
-              <w:t>[Fecha estimada de presentación de ofertas (mes)]</w:t>
+              <w:t>{{</w:t>
+            </w:r>
+            <w:r>
+              <w:rPr>
+                <w:rFonts w:ascii="Franklin Gothic Medium" w:eastAsia="Times New Roman" w:hAnsi="Franklin Gothic Medium" w:cs="Arial"/>
+                <w:bCs/>
+                <w:sz w:val="14"/>
+                <w:szCs w:val="12"/>
+                <w:lang w:eastAsia="es-CO"/>
+              </w:rPr>
+              <w:t>Fecha estimada de presentación de ofertas (mes)</w:t>
+            </w:r>
+            <w:r>
+              <w:t>}}</w:t>
             </w:r>
           </w:p>
         </w:tc>
@@ -1561,15 +1608,23 @@
               </w:rPr>
             </w:pPr>
             <w:r>
-              <w:rPr>
-                <w:rFonts w:ascii="Franklin Gothic Medium" w:eastAsia="Times New Roman" w:hAnsi="Franklin Gothic Medium" w:cs="Arial"/>
-                <w:bCs/>
-                <w:sz w:val="14"/>
-                <w:szCs w:val="12"/>
-                <w:lang w:eastAsia="es-CO"/>
-              </w:rPr>
-              <w:t>[Duración del contrato (número)]</w:t>
-            </w:r>
+              <w:t>{{</w:t>
+            </w:r>
+            <w:r>
+              <w:rPr>
+                <w:rFonts w:ascii="Franklin Gothic Medium" w:eastAsia="Times New Roman" w:hAnsi="Franklin Gothic Medium" w:cs="Arial"/>
+                <w:bCs/>
+                <w:sz w:val="14"/>
+                <w:szCs w:val="12"/>
+                <w:lang w:eastAsia="es-CO"/>
+              </w:rPr>
+              <w:t>Duración del contrato (número</w:t>
+            </w:r>
+            <w:r>
+              <w:t>}}</w:t>
+            </w:r>
+            <w:bookmarkStart w:id="0" w:name="_GoBack"/>
+            <w:bookmarkEnd w:id="0"/>
           </w:p>
         </w:tc>
         <w:tc>
@@ -1596,14 +1651,20 @@
               </w:rPr>
             </w:pPr>
             <w:r>
-              <w:rPr>
-                <w:rFonts w:ascii="Franklin Gothic Medium" w:eastAsia="Times New Roman" w:hAnsi="Franklin Gothic Medium" w:cs="Arial"/>
-                <w:bCs/>
-                <w:sz w:val="14"/>
-                <w:szCs w:val="12"/>
-                <w:lang w:eastAsia="es-CO"/>
-              </w:rPr>
-              <w:t>[Duración del contrato (número)]2</w:t>
+              <w:t>{{</w:t>
+            </w:r>
+            <w:r>
+              <w:rPr>
+                <w:rFonts w:ascii="Franklin Gothic Medium" w:eastAsia="Times New Roman" w:hAnsi="Franklin Gothic Medium" w:cs="Arial"/>
+                <w:bCs/>
+                <w:sz w:val="14"/>
+                <w:szCs w:val="12"/>
+                <w:lang w:eastAsia="es-CO"/>
+              </w:rPr>
+              <w:t>Duración del contrato (número)</w:t>
+            </w:r>
+            <w:r>
+              <w:t xml:space="preserve"> }}</w:t>
             </w:r>
           </w:p>
         </w:tc>
@@ -1630,14 +1691,20 @@
               </w:rPr>
             </w:pPr>
             <w:r>
-              <w:rPr>
-                <w:rFonts w:ascii="Franklin Gothic Medium" w:eastAsia="Times New Roman" w:hAnsi="Franklin Gothic Medium" w:cs="Arial"/>
-                <w:bCs/>
-                <w:sz w:val="14"/>
-                <w:szCs w:val="12"/>
-                <w:lang w:eastAsia="es-CO"/>
-              </w:rPr>
-              <w:t>[Modalidad de selección]</w:t>
+              <w:t>{{</w:t>
+            </w:r>
+            <w:r>
+              <w:rPr>
+                <w:rFonts w:ascii="Franklin Gothic Medium" w:eastAsia="Times New Roman" w:hAnsi="Franklin Gothic Medium" w:cs="Arial"/>
+                <w:bCs/>
+                <w:sz w:val="14"/>
+                <w:szCs w:val="12"/>
+                <w:lang w:eastAsia="es-CO"/>
+              </w:rPr>
+              <w:t>Modalidad de selección</w:t>
+            </w:r>
+            <w:r>
+              <w:t>}}</w:t>
             </w:r>
           </w:p>
         </w:tc>
@@ -1664,14 +1731,20 @@
               </w:rPr>
             </w:pPr>
             <w:r>
-              <w:rPr>
-                <w:rFonts w:ascii="Franklin Gothic Medium" w:eastAsia="Times New Roman" w:hAnsi="Franklin Gothic Medium" w:cs="Arial"/>
-                <w:bCs/>
-                <w:sz w:val="14"/>
-                <w:szCs w:val="12"/>
-                <w:lang w:eastAsia="es-CO"/>
-              </w:rPr>
-              <w:t>[Fuente de los recursos]</w:t>
+              <w:t>{{</w:t>
+            </w:r>
+            <w:r>
+              <w:rPr>
+                <w:rFonts w:ascii="Franklin Gothic Medium" w:eastAsia="Times New Roman" w:hAnsi="Franklin Gothic Medium" w:cs="Arial"/>
+                <w:bCs/>
+                <w:sz w:val="14"/>
+                <w:szCs w:val="12"/>
+                <w:lang w:eastAsia="es-CO"/>
+              </w:rPr>
+              <w:t>Fuente de los recursos</w:t>
+            </w:r>
+            <w:r>
+              <w:t>}}</w:t>
             </w:r>
           </w:p>
         </w:tc>
@@ -1698,14 +1771,20 @@
               </w:rPr>
             </w:pPr>
             <w:r>
-              <w:rPr>
-                <w:rFonts w:ascii="Franklin Gothic Medium" w:eastAsia="Times New Roman" w:hAnsi="Franklin Gothic Medium" w:cs="Arial"/>
-                <w:bCs/>
-                <w:sz w:val="14"/>
-                <w:szCs w:val="12"/>
-                <w:lang w:eastAsia="es-CO"/>
-              </w:rPr>
-              <w:t>[Valor total estimad]</w:t>
+              <w:t>{{</w:t>
+            </w:r>
+            <w:r>
+              <w:rPr>
+                <w:rFonts w:ascii="Franklin Gothic Medium" w:eastAsia="Times New Roman" w:hAnsi="Franklin Gothic Medium" w:cs="Arial"/>
+                <w:bCs/>
+                <w:sz w:val="14"/>
+                <w:szCs w:val="12"/>
+                <w:lang w:eastAsia="es-CO"/>
+              </w:rPr>
+              <w:t>Valor total estimad</w:t>
+            </w:r>
+            <w:r>
+              <w:t>}}</w:t>
             </w:r>
           </w:p>
         </w:tc>
@@ -1732,14 +1811,20 @@
               </w:rPr>
             </w:pPr>
             <w:r>
-              <w:rPr>
-                <w:rFonts w:ascii="Franklin Gothic Medium" w:eastAsia="Times New Roman" w:hAnsi="Franklin Gothic Medium" w:cs="Arial"/>
-                <w:bCs/>
-                <w:sz w:val="14"/>
-                <w:szCs w:val="12"/>
-                <w:lang w:eastAsia="es-CO"/>
-              </w:rPr>
-              <w:t>[Valor estimado en la vigencia actual]</w:t>
+              <w:t>{{</w:t>
+            </w:r>
+            <w:r>
+              <w:rPr>
+                <w:rFonts w:ascii="Franklin Gothic Medium" w:eastAsia="Times New Roman" w:hAnsi="Franklin Gothic Medium" w:cs="Arial"/>
+                <w:bCs/>
+                <w:sz w:val="14"/>
+                <w:szCs w:val="12"/>
+                <w:lang w:eastAsia="es-CO"/>
+              </w:rPr>
+              <w:t>Valor estimado en la vigencia actual</w:t>
+            </w:r>
+            <w:r>
+              <w:t>}}</w:t>
             </w:r>
           </w:p>
         </w:tc>
@@ -1766,15 +1851,7 @@
               </w:rPr>
             </w:pPr>
             <w:r>
-              <w:rPr>
-                <w:rFonts w:ascii="Franklin Gothic Medium" w:eastAsia="Times New Roman" w:hAnsi="Franklin Gothic Medium" w:cs="Arial"/>
-                <w:b/>
-                <w:bCs/>
-                <w:sz w:val="14"/>
-                <w:szCs w:val="12"/>
-                <w:lang w:eastAsia="es-CO"/>
-              </w:rPr>
-              <w:t>[</w:t>
+              <w:t>{{</w:t>
             </w:r>
             <w:r>
               <w:rPr>
@@ -1788,15 +1865,7 @@
               <w:t>Ubicación</w:t>
             </w:r>
             <w:r>
-              <w:rPr>
-                <w:rFonts w:ascii="Franklin Gothic Medium" w:eastAsia="Times New Roman" w:hAnsi="Franklin Gothic Medium" w:cs="Arial"/>
-                <w:b/>
-                <w:bCs/>
-                <w:sz w:val="14"/>
-                <w:szCs w:val="12"/>
-                <w:lang w:eastAsia="es-CO"/>
-              </w:rPr>
-              <w:t>]</w:t>
+              <w:t>}}</w:t>
             </w:r>
           </w:p>
         </w:tc>
@@ -1823,14 +1892,20 @@
               </w:rPr>
             </w:pPr>
             <w:r>
-              <w:rPr>
-                <w:rFonts w:ascii="Franklin Gothic Medium" w:eastAsia="Times New Roman" w:hAnsi="Franklin Gothic Medium" w:cs="Arial"/>
-                <w:bCs/>
-                <w:sz w:val="14"/>
-                <w:szCs w:val="12"/>
-                <w:lang w:eastAsia="es-CO"/>
-              </w:rPr>
-              <w:t>[Nombre del responsable]</w:t>
+              <w:t>{{</w:t>
+            </w:r>
+            <w:r>
+              <w:rPr>
+                <w:rFonts w:ascii="Franklin Gothic Medium" w:eastAsia="Times New Roman" w:hAnsi="Franklin Gothic Medium" w:cs="Arial"/>
+                <w:bCs/>
+                <w:sz w:val="14"/>
+                <w:szCs w:val="12"/>
+                <w:lang w:eastAsia="es-CO"/>
+              </w:rPr>
+              <w:t>Nombre del responsable</w:t>
+            </w:r>
+            <w:r>
+              <w:t>}}</w:t>
             </w:r>
           </w:p>
         </w:tc>
@@ -1857,14 +1932,20 @@
               </w:rPr>
             </w:pPr>
             <w:r>
-              <w:rPr>
-                <w:rFonts w:ascii="Franklin Gothic Medium" w:eastAsia="Times New Roman" w:hAnsi="Franklin Gothic Medium" w:cs="Arial"/>
-                <w:bCs/>
-                <w:sz w:val="14"/>
-                <w:szCs w:val="12"/>
-                <w:lang w:eastAsia="es-CO"/>
-              </w:rPr>
-              <w:t>[Teléfono del responsable]</w:t>
+              <w:t>{{</w:t>
+            </w:r>
+            <w:r>
+              <w:rPr>
+                <w:rFonts w:ascii="Franklin Gothic Medium" w:eastAsia="Times New Roman" w:hAnsi="Franklin Gothic Medium" w:cs="Arial"/>
+                <w:bCs/>
+                <w:sz w:val="14"/>
+                <w:szCs w:val="12"/>
+                <w:lang w:eastAsia="es-CO"/>
+              </w:rPr>
+              <w:t>Teléfono del responsable</w:t>
+            </w:r>
+            <w:r>
+              <w:t>}}</w:t>
             </w:r>
           </w:p>
         </w:tc>
@@ -1891,14 +1972,20 @@
               </w:rPr>
             </w:pPr>
             <w:r>
-              <w:rPr>
-                <w:rFonts w:ascii="Franklin Gothic Medium" w:eastAsia="Times New Roman" w:hAnsi="Franklin Gothic Medium" w:cs="Arial"/>
-                <w:bCs/>
-                <w:sz w:val="14"/>
-                <w:szCs w:val="12"/>
-                <w:lang w:eastAsia="es-CO"/>
-              </w:rPr>
-              <w:t>[Correo electrónico del responsable]</w:t>
+              <w:t>{{</w:t>
+            </w:r>
+            <w:r>
+              <w:rPr>
+                <w:rFonts w:ascii="Franklin Gothic Medium" w:eastAsia="Times New Roman" w:hAnsi="Franklin Gothic Medium" w:cs="Arial"/>
+                <w:bCs/>
+                <w:sz w:val="14"/>
+                <w:szCs w:val="12"/>
+                <w:lang w:eastAsia="es-CO"/>
+              </w:rPr>
+              <w:t>Correo electrónico del responsable</w:t>
+            </w:r>
+            <w:r>
+              <w:t>}}</w:t>
             </w:r>
           </w:p>
         </w:tc>
@@ -4004,6 +4091,17 @@
                 <w:lang w:eastAsia="es-CO"/>
               </w:rPr>
             </w:pPr>
+            <w:r>
+              <w:t>{{</w:t>
+            </w:r>
+            <w:proofErr w:type="spellStart"/>
+            <w:r>
+              <w:t>codigo</w:t>
+            </w:r>
+            <w:proofErr w:type="spellEnd"/>
+            <w:r>
+              <w:t>}}</w:t>
+            </w:r>
           </w:p>
         </w:tc>
         <w:tc>
@@ -4029,6 +4127,17 @@
                 <w:lang w:eastAsia="es-CO"/>
               </w:rPr>
             </w:pPr>
+            <w:r>
+              <w:t>{{</w:t>
+            </w:r>
+            <w:proofErr w:type="spellStart"/>
+            <w:r>
+              <w:t>descripcion</w:t>
+            </w:r>
+            <w:proofErr w:type="spellEnd"/>
+            <w:r>
+              <w:t>}}</w:t>
+            </w:r>
           </w:p>
         </w:tc>
         <w:tc>
@@ -4053,6 +4162,19 @@
                 <w:lang w:eastAsia="es-CO"/>
               </w:rPr>
             </w:pPr>
+            <w:r>
+              <w:t>{{</w:t>
+            </w:r>
+            <w:r>
+              <w:rPr>
+                <w:rFonts w:ascii="Franklin Gothic Medium" w:eastAsia="Times New Roman" w:hAnsi="Franklin Gothic Medium" w:cs="Arial"/>
+                <w:bCs/>
+                <w:sz w:val="14"/>
+                <w:szCs w:val="12"/>
+                <w:lang w:eastAsia="es-CO"/>
+              </w:rPr>
+              <w:t>Fecha estimada de inicio de proceso de selección (mes)]</w:t>
+            </w:r>
           </w:p>
         </w:tc>
         <w:tc>
@@ -4078,6 +4200,22 @@
                 <w:lang w:eastAsia="es-CO"/>
               </w:rPr>
             </w:pPr>
+            <w:r>
+              <w:t>{{</w:t>
+            </w:r>
+            <w:r>
+              <w:rPr>
+                <w:rFonts w:ascii="Franklin Gothic Medium" w:eastAsia="Times New Roman" w:hAnsi="Franklin Gothic Medium" w:cs="Arial"/>
+                <w:bCs/>
+                <w:sz w:val="14"/>
+                <w:szCs w:val="12"/>
+                <w:lang w:eastAsia="es-CO"/>
+              </w:rPr>
+              <w:t>Fecha estimada de presentación de ofertas (mes)</w:t>
+            </w:r>
+            <w:r>
+              <w:t xml:space="preserve"> }}</w:t>
+            </w:r>
           </w:p>
         </w:tc>
         <w:tc>
@@ -4103,6 +4241,19 @@
                 <w:lang w:eastAsia="es-CO"/>
               </w:rPr>
             </w:pPr>
+            <w:r>
+              <w:t>{{</w:t>
+            </w:r>
+            <w:r>
+              <w:rPr>
+                <w:rFonts w:ascii="Franklin Gothic Medium" w:eastAsia="Times New Roman" w:hAnsi="Franklin Gothic Medium" w:cs="Arial"/>
+                <w:bCs/>
+                <w:sz w:val="14"/>
+                <w:szCs w:val="12"/>
+                <w:lang w:eastAsia="es-CO"/>
+              </w:rPr>
+              <w:t>Duración del contrato (número)]</w:t>
+            </w:r>
           </w:p>
         </w:tc>
         <w:tc>
@@ -4128,6 +4279,22 @@
                 <w:lang w:eastAsia="es-CO"/>
               </w:rPr>
             </w:pPr>
+            <w:r>
+              <w:t>{{</w:t>
+            </w:r>
+            <w:r>
+              <w:rPr>
+                <w:rFonts w:ascii="Franklin Gothic Medium" w:eastAsia="Times New Roman" w:hAnsi="Franklin Gothic Medium" w:cs="Arial"/>
+                <w:bCs/>
+                <w:sz w:val="14"/>
+                <w:szCs w:val="12"/>
+                <w:lang w:eastAsia="es-CO"/>
+              </w:rPr>
+              <w:t>Duración del contrato (número)</w:t>
+            </w:r>
+            <w:r>
+              <w:t xml:space="preserve"> }}</w:t>
+            </w:r>
           </w:p>
         </w:tc>
         <w:tc>
@@ -4152,6 +4319,22 @@
                 <w:lang w:eastAsia="es-CO"/>
               </w:rPr>
             </w:pPr>
+            <w:r>
+              <w:t>{{</w:t>
+            </w:r>
+            <w:r>
+              <w:rPr>
+                <w:rFonts w:ascii="Franklin Gothic Medium" w:eastAsia="Times New Roman" w:hAnsi="Franklin Gothic Medium" w:cs="Arial"/>
+                <w:bCs/>
+                <w:sz w:val="14"/>
+                <w:szCs w:val="12"/>
+                <w:lang w:eastAsia="es-CO"/>
+              </w:rPr>
+              <w:t>Modalidad de selección</w:t>
+            </w:r>
+            <w:r>
+              <w:t>}}</w:t>
+            </w:r>
           </w:p>
         </w:tc>
         <w:tc>
@@ -4176,6 +4359,22 @@
                 <w:lang w:eastAsia="es-CO"/>
               </w:rPr>
             </w:pPr>
+            <w:r>
+              <w:t>{{</w:t>
+            </w:r>
+            <w:r>
+              <w:rPr>
+                <w:rFonts w:ascii="Franklin Gothic Medium" w:eastAsia="Times New Roman" w:hAnsi="Franklin Gothic Medium" w:cs="Arial"/>
+                <w:bCs/>
+                <w:sz w:val="14"/>
+                <w:szCs w:val="12"/>
+                <w:lang w:eastAsia="es-CO"/>
+              </w:rPr>
+              <w:t>Fuente de los recursos</w:t>
+            </w:r>
+            <w:r>
+              <w:t>}}</w:t>
+            </w:r>
           </w:p>
         </w:tc>
         <w:tc>
@@ -4200,6 +4399,22 @@
                 <w:lang w:eastAsia="es-CO"/>
               </w:rPr>
             </w:pPr>
+            <w:r>
+              <w:t>{{</w:t>
+            </w:r>
+            <w:r>
+              <w:rPr>
+                <w:rFonts w:ascii="Franklin Gothic Medium" w:eastAsia="Times New Roman" w:hAnsi="Franklin Gothic Medium" w:cs="Arial"/>
+                <w:bCs/>
+                <w:sz w:val="14"/>
+                <w:szCs w:val="12"/>
+                <w:lang w:eastAsia="es-CO"/>
+              </w:rPr>
+              <w:t>Valor total estimad</w:t>
+            </w:r>
+            <w:r>
+              <w:t>}}</w:t>
+            </w:r>
           </w:p>
         </w:tc>
         <w:tc>
@@ -4224,6 +4439,22 @@
                 <w:lang w:eastAsia="es-CO"/>
               </w:rPr>
             </w:pPr>
+            <w:r>
+              <w:t>{{</w:t>
+            </w:r>
+            <w:r>
+              <w:rPr>
+                <w:rFonts w:ascii="Franklin Gothic Medium" w:eastAsia="Times New Roman" w:hAnsi="Franklin Gothic Medium" w:cs="Arial"/>
+                <w:bCs/>
+                <w:sz w:val="14"/>
+                <w:szCs w:val="12"/>
+                <w:lang w:eastAsia="es-CO"/>
+              </w:rPr>
+              <w:t>Valor estimado en la vigencia actual</w:t>
+            </w:r>
+            <w:r>
+              <w:t>}}</w:t>
+            </w:r>
           </w:p>
         </w:tc>
         <w:tc>
@@ -4248,6 +4479,23 @@
                 <w:lang w:eastAsia="es-CO"/>
               </w:rPr>
             </w:pPr>
+            <w:r>
+              <w:t>{{</w:t>
+            </w:r>
+            <w:r>
+              <w:rPr>
+                <w:rFonts w:ascii="Franklin Gothic Medium" w:eastAsia="Times New Roman" w:hAnsi="Franklin Gothic Medium" w:cs="Arial"/>
+                <w:b/>
+                <w:bCs/>
+                <w:sz w:val="14"/>
+                <w:szCs w:val="12"/>
+                <w:lang w:eastAsia="es-CO"/>
+              </w:rPr>
+              <w:t>Ubicación</w:t>
+            </w:r>
+            <w:r>
+              <w:t>}}</w:t>
+            </w:r>
           </w:p>
         </w:tc>
         <w:tc>
@@ -4272,6 +4520,22 @@
                 <w:lang w:eastAsia="es-CO"/>
               </w:rPr>
             </w:pPr>
+            <w:r>
+              <w:t>{{</w:t>
+            </w:r>
+            <w:r>
+              <w:rPr>
+                <w:rFonts w:ascii="Franklin Gothic Medium" w:eastAsia="Times New Roman" w:hAnsi="Franklin Gothic Medium" w:cs="Arial"/>
+                <w:bCs/>
+                <w:sz w:val="14"/>
+                <w:szCs w:val="12"/>
+                <w:lang w:eastAsia="es-CO"/>
+              </w:rPr>
+              <w:t>Nombre del responsable</w:t>
+            </w:r>
+            <w:r>
+              <w:t>}}</w:t>
+            </w:r>
           </w:p>
         </w:tc>
         <w:tc>
@@ -4296,6 +4560,22 @@
                 <w:lang w:eastAsia="es-CO"/>
               </w:rPr>
             </w:pPr>
+            <w:r>
+              <w:t>{{</w:t>
+            </w:r>
+            <w:r>
+              <w:rPr>
+                <w:rFonts w:ascii="Franklin Gothic Medium" w:eastAsia="Times New Roman" w:hAnsi="Franklin Gothic Medium" w:cs="Arial"/>
+                <w:bCs/>
+                <w:sz w:val="14"/>
+                <w:szCs w:val="12"/>
+                <w:lang w:eastAsia="es-CO"/>
+              </w:rPr>
+              <w:t>Teléfono del responsable</w:t>
+            </w:r>
+            <w:r>
+              <w:t>}}</w:t>
+            </w:r>
           </w:p>
         </w:tc>
         <w:tc>
@@ -4320,6 +4600,22 @@
                 <w:lang w:eastAsia="es-CO"/>
               </w:rPr>
             </w:pPr>
+            <w:r>
+              <w:t>{{</w:t>
+            </w:r>
+            <w:r>
+              <w:rPr>
+                <w:rFonts w:ascii="Franklin Gothic Medium" w:eastAsia="Times New Roman" w:hAnsi="Franklin Gothic Medium" w:cs="Arial"/>
+                <w:bCs/>
+                <w:sz w:val="14"/>
+                <w:szCs w:val="12"/>
+                <w:lang w:eastAsia="es-CO"/>
+              </w:rPr>
+              <w:t>Correo electrónico del responsable</w:t>
+            </w:r>
+            <w:r>
+              <w:t>}}</w:t>
+            </w:r>
           </w:p>
         </w:tc>
       </w:tr>
@@ -4429,13 +4725,17 @@
             <w:r>
               <w:t>{{</w:t>
             </w:r>
-            <w:proofErr w:type="spellStart"/>
-            <w:r>
-              <w:t>justificacion</w:t>
-            </w:r>
-            <w:proofErr w:type="spellEnd"/>
-            <w:r>
-              <w:t>}}</w:t>
+            <w:r>
+              <w:t>J</w:t>
+            </w:r>
+            <w:r>
+              <w:t>ustificaci</w:t>
+            </w:r>
+            <w:r>
+              <w:t>ó</w:t>
+            </w:r>
+            <w:r>
+              <w:t>n}}</w:t>
             </w:r>
           </w:p>
         </w:tc>
@@ -4570,10 +4870,10 @@
               <w:t>{{</w:t>
             </w:r>
             <w:r>
-              <w:t>nombre responsable</w:t>
-            </w:r>
-            <w:r>
-              <w:t>}}</w:t>
+              <w:t>N</w:t>
+            </w:r>
+            <w:r>
+              <w:t>ombre responsable}}</w:t>
             </w:r>
           </w:p>
         </w:tc>
@@ -4621,10 +4921,10 @@
               <w:t>{{</w:t>
             </w:r>
             <w:r>
-              <w:t>cargo</w:t>
-            </w:r>
-            <w:r>
-              <w:t>}}</w:t>
+              <w:t>C</w:t>
+            </w:r>
+            <w:r>
+              <w:t>argo}}</w:t>
             </w:r>
           </w:p>
         </w:tc>
@@ -4671,11 +4971,9 @@
             <w:r>
               <w:t>{{</w:t>
             </w:r>
-            <w:proofErr w:type="spellStart"/>
-            <w:r>
-              <w:t>cc</w:t>
-            </w:r>
-            <w:proofErr w:type="spellEnd"/>
+            <w:r>
+              <w:t>Cedula de responsable</w:t>
+            </w:r>
             <w:r>
               <w:t>}}</w:t>
             </w:r>
@@ -4818,7 +5116,6 @@
         </w:rPr>
       </w:pPr>
     </w:p>
-    <w:bookmarkEnd w:id="0"/>
     <w:p>
       <w:pPr>
         <w:spacing w:after="0" w:line="240" w:lineRule="auto"/>
@@ -8138,6 +8435,7 @@
     <w:rsid w:val="003228EC"/>
     <w:rsid w:val="00382C29"/>
     <w:rsid w:val="004F2643"/>
+    <w:rsid w:val="004F7E99"/>
     <w:rsid w:val="00501783"/>
     <w:rsid w:val="005245FD"/>
     <w:rsid w:val="00527C9C"/>
@@ -8158,12 +8456,14 @@
     <w:rsid w:val="009855FF"/>
     <w:rsid w:val="00A15C31"/>
     <w:rsid w:val="00A67AEC"/>
+    <w:rsid w:val="00AB724E"/>
     <w:rsid w:val="00AF4400"/>
     <w:rsid w:val="00BE6449"/>
     <w:rsid w:val="00C3534E"/>
     <w:rsid w:val="00C863EF"/>
     <w:rsid w:val="00C87D75"/>
     <w:rsid w:val="00D42B38"/>
+    <w:rsid w:val="00D748F5"/>
     <w:rsid w:val="00EC1537"/>
     <w:rsid w:val="00F00699"/>
     <w:rsid w:val="00F7263E"/>
@@ -8935,7 +9235,7 @@
 </file>
 
 <file path=customXml/itemProps1.xml><?xml version="1.0" encoding="utf-8"?>
-<ds:datastoreItem xmlns:ds="http://schemas.openxmlformats.org/officeDocument/2006/customXml" ds:itemID="{C7656FE0-A6E0-446F-BF85-24E0E6B8D7DD}">
+<ds:datastoreItem xmlns:ds="http://schemas.openxmlformats.org/officeDocument/2006/customXml" ds:itemID="{AD5C1492-B910-4521-8C5C-38EE2730DC29}">
   <ds:schemaRefs>
     <ds:schemaRef ds:uri="http://schemas.openxmlformats.org/officeDocument/2006/bibliography"/>
   </ds:schemaRefs>

</xml_diff>